<commit_message>
Add clickable personal-site link (kexin.uno) to the CV
</commit_message>
<xml_diff>
--- a/resume/resume.docx
+++ b/resume/resume.docx
@@ -56,6 +56,15 @@
           <w:sz w:val="20"/>
         </w:rPr>
         <w:t>联系方式：15319902705（同微信） · 2753538923@qq.com · GitHub: Tang-0118</w:t>
+      </w:r>
+      <w:r>
+        <w:rPr>
+          <w:rFonts w:ascii="微软雅黑" w:hAnsi="微软雅黑" w:eastAsia="微软雅黑"/>
+          <w:b w:val="0"/>
+          <w:color w:val="5A6470"/>
+          <w:sz w:val="20"/>
+        </w:rPr>
+        <w:t xml:space="preserve"> · 主页：kexin.uno</w:t>
       </w:r>
     </w:p>
     <w:p>

</xml_diff>

<commit_message>
Add recently self-learning RAG to skills and the learning list
</commit_message>
<xml_diff>
--- a/resume/resume.docx
+++ b/resume/resume.docx
@@ -240,6 +240,20 @@
           <w:sz w:val="20"/>
         </w:rPr>
         <w:t>工程化与工具链：PyQt5、Git、PyInstaller、pyserial（Modbus RTU）、多线程 / 队列、工业相机 SDK（MVS）</w:t>
+      </w:r>
+    </w:p>
+    <w:p>
+      <w:pPr>
+        <w:spacing w:before="0" w:after="20" w:line="276" w:lineRule="auto"/>
+      </w:pPr>
+      <w:r>
+        <w:rPr>
+          <w:rFonts w:ascii="微软雅黑" w:hAnsi="微软雅黑" w:eastAsia="微软雅黑"/>
+          <w:b w:val="0"/>
+          <w:color w:val="19232D"/>
+          <w:sz w:val="20"/>
+        </w:rPr>
+        <w:t>大模型与检索：RAG（检索增强生成，自学中）、向量检索、Rerank</w:t>
       </w:r>
     </w:p>
     <w:p>

</xml_diff>

<commit_message>
Drop the software-copyright serial and the self-study note on RAG
</commit_message>
<xml_diff>
--- a/resume/resume.docx
+++ b/resume/resume.docx
@@ -253,7 +253,7 @@
           <w:color w:val="19232D"/>
           <w:sz w:val="20"/>
         </w:rPr>
-        <w:t>大模型与检索：RAG（检索增强生成，自学中）、向量检索、Rerank</w:t>
+        <w:t>大模型与检索：RAG（检索增强生成）、向量检索、Rerank</w:t>
       </w:r>
     </w:p>
     <w:p>
@@ -452,7 +452,7 @@
           <w:color w:val="19232D"/>
           <w:sz w:val="20"/>
         </w:rPr>
-        <w:t xml:space="preserve"> 登记已受理（2026R11L1069227）· 专利在审</w:t>
+        <w:t xml:space="preserve"> 登记已受理 · 专利在审</w:t>
       </w:r>
     </w:p>
     <w:p>

</xml_diff>

<commit_message>
Workshop safety project: model training + algorithm role
</commit_message>
<xml_diff>
--- a/resume/resume.docx
+++ b/resume/resume.docx
@@ -528,7 +528,7 @@
           <w:color w:val="19232D"/>
           <w:sz w:val="20"/>
         </w:rPr>
-        <w:t>概述：面向无人车间的安全防护系统：机械臂等自动化设备运行时，一旦检测到人员进入设备区域立即输出锁机信号停止设备；本人负责人员检测与多路相机实时推理、安全状态机与上位机软件开发，并完成 CPU（2 路）/ GPU（4 路）两套现场版本交付。</w:t>
+        <w:t>概述：面向无人车间的安全防护系统：机械臂等自动化设备运行时，一旦检测到人员进入设备区域立即输出锁机信号停止设备；本人负责 YOLOv8 人员检测模型的训练与调优、多路相机实时推理、安全状态机与上位机软件开发，并完成 CPU（2 路）/ GPU（4 路）两套现场版本交付。</w:t>
       </w:r>
     </w:p>
     <w:p>
@@ -584,7 +584,7 @@
           <w:color w:val="19232D"/>
           <w:sz w:val="20"/>
         </w:rPr>
-        <w:t>YOLOv8 单类人员检测，2–4 路 1280×720 工业相机并发；推理按「只保留最新帧 + 轮询公平调度 + batch=1」组织，不等待凑批；以 ModelFactory 统一 backend 协议，可在 PyTorch（CUDA / CPU）、ONNXRuntime、算能 Sophon NPU 之间切换</w:t>
+        <w:t>YOLOv8 单类人员检测（自训模型），2–4 路 1280×720 工业相机并发；推理按「只保留最新帧 + 轮询公平调度 + batch=1」组织，不等待凑批；以 ModelFactory 统一 backend 协议，可在 PyTorch（CUDA / CPU）、ONNXRuntime、算能 Sophon NPU 之间切换</w:t>
       </w:r>
     </w:p>
     <w:p>

</xml_diff>

<commit_message>
feat(resume): add AI Copilot content to master docx and regenerate PDFs; add AI full-stack intention
</commit_message>
<xml_diff>
--- a/resume/resume.docx
+++ b/resume/resume.docx
@@ -27,7 +27,7 @@
           <w:color w:val="5A6470"/>
           <w:sz w:val="21"/>
         </w:rPr>
-        <w:t>求职意向：计算机视觉 / 图形图像算法</w:t>
+        <w:t>求职意向：AI 全栈 / AI 应用 / 多模态（VLM）· 计算机视觉算法</w:t>
       </w:r>
     </w:p>
     <w:p>
@@ -41,7 +41,7 @@
           <w:color w:val="19232D"/>
           <w:sz w:val="21"/>
         </w:rPr>
-        <w:t>专注计算机视觉与深度学习算法的工程落地：目标检测、图像量测与工业质检。</w:t>
+        <w:t>专注计算机视觉与 AI 应用的工程落地：目标检测、图像量测、工业质检，以及工具型 Agent 与多模态应用。</w:t>
       </w:r>
     </w:p>
     <w:p>
@@ -253,7 +253,7 @@
           <w:color w:val="19232D"/>
           <w:sz w:val="20"/>
         </w:rPr>
-        <w:t>大模型与检索：RAG（检索增强生成）、向量检索、Rerank</w:t>
+        <w:t>大模型与检索：RAG（检索增强生成）、向量检索、Rerank、工具调用 / Agent 编排、FastAPI、多模态（VLM）、评测体系</w:t>
       </w:r>
     </w:p>
     <w:p>
@@ -799,7 +799,7 @@
           <w:color w:val="5C4ADC"/>
           <w:sz w:val="19"/>
         </w:rPr>
-        <w:t>技术栈：Python、OpenCV、NumPy、PyQt5、多线程 / 队列、pyserial（Modbus RTU）、C SDK 封装（ctypes）、PyInstaller</w:t>
+        <w:t>技术栈：Python、OpenCV、NumPy、PyQt5、多线程 / 队列、pyserial（Modbus RTU）、C SDK 封装（ctypes）、PyInstaller、FastAPI、RAG、VLM</w:t>
       </w:r>
     </w:p>
     <w:p>
@@ -968,6 +968,114 @@
           <w:sz w:val="20"/>
         </w:rPr>
         <w:t>判定阈值全配置化热更新，配置持久化 SHA256 指纹 + 离线批量回归工具，保证「同图同结论」；多线程队列流水线（线程池存图、相机健康度重连、PLC 故障自动停机）支撑产线连续运行</w:t>
+      </w:r>
+    </w:p>
+    <w:p>
+      <w:pPr>
+        <w:spacing w:before="0" w:after="40" w:line="276" w:lineRule="auto"/>
+        <w:ind w:left="320" w:hanging="320"/>
+      </w:pPr>
+      <w:r>
+        <w:rPr>
+          <w:rFonts w:ascii="微软雅黑" w:hAnsi="微软雅黑" w:eastAsia="微软雅黑"/>
+          <w:b w:val="0"/>
+          <w:color w:val="19232D"/>
+          <w:sz w:val="20"/>
+        </w:rPr>
+        <w:t>•</w:t>
+      </w:r>
+      <w:r>
+        <w:rPr>
+          <w:rFonts w:ascii="微软雅黑" w:hAnsi="微软雅黑" w:eastAsia="微软雅黑"/>
+          <w:b w:val="0"/>
+          <w:color w:val="19232D"/>
+          <w:sz w:val="20"/>
+        </w:rPr>
+        <w:tab/>
+      </w:r>
+      <w:r>
+        <w:rPr>
+          <w:rFonts w:ascii="微软雅黑" w:hAnsi="微软雅黑" w:eastAsia="微软雅黑"/>
+          <w:b/>
+          <w:color w:val="19232D"/>
+          <w:sz w:val="20"/>
+        </w:rPr>
+        <w:t>AI 层（工具型 Agent + RAG）：</w:t>
+      </w:r>
+      <w:r>
+        <w:t>不改动原有相机 / 算法 / PLC，在旁边加独立 AI 应用层；八个工具覆盖单袋查询、按结果筛选、按测量值排序、超出阈值比例排序（找最接近合格的 NG）、原因分布、班次对比、连续同原因 NG 检测与知识检索，先判断「问一袋还是问一批」再选工具</w:t>
+      </w:r>
+    </w:p>
+    <w:p>
+      <w:pPr>
+        <w:spacing w:before="0" w:after="40" w:line="276" w:lineRule="auto"/>
+        <w:ind w:left="320" w:hanging="320"/>
+      </w:pPr>
+      <w:r>
+        <w:rPr>
+          <w:rFonts w:ascii="微软雅黑" w:hAnsi="微软雅黑" w:eastAsia="微软雅黑"/>
+          <w:b w:val="0"/>
+          <w:color w:val="19232D"/>
+          <w:sz w:val="20"/>
+        </w:rPr>
+        <w:t>•</w:t>
+      </w:r>
+      <w:r>
+        <w:rPr>
+          <w:rFonts w:ascii="微软雅黑" w:hAnsi="微软雅黑" w:eastAsia="微软雅黑"/>
+          <w:b w:val="0"/>
+          <w:color w:val="19232D"/>
+          <w:sz w:val="20"/>
+        </w:rPr>
+        <w:tab/>
+      </w:r>
+      <w:r>
+        <w:rPr>
+          <w:rFonts w:ascii="微软雅黑" w:hAnsi="微软雅黑" w:eastAsia="微软雅黑"/>
+          <w:b/>
+          <w:color w:val="19232D"/>
+          <w:sz w:val="20"/>
+        </w:rPr>
+        <w:t>检索与边界：</w:t>
+      </w:r>
+      <w:r>
+        <w:t>BM25 与向量按 0.6 / 0.4 融合后重排取前 5，答案必须带出处；不可答题 9 条全部正确拒答；视觉模型只允许判断有没有露出银边，禁止评价褶皱与工艺参数，119 例人工标注上越界 0 例</w:t>
+      </w:r>
+    </w:p>
+    <w:p>
+      <w:pPr>
+        <w:spacing w:before="0" w:after="40" w:line="276" w:lineRule="auto"/>
+        <w:ind w:left="320" w:hanging="320"/>
+      </w:pPr>
+      <w:r>
+        <w:rPr>
+          <w:rFonts w:ascii="微软雅黑" w:hAnsi="微软雅黑" w:eastAsia="微软雅黑"/>
+          <w:b w:val="0"/>
+          <w:color w:val="19232D"/>
+          <w:sz w:val="20"/>
+        </w:rPr>
+        <w:t>•</w:t>
+      </w:r>
+      <w:r>
+        <w:rPr>
+          <w:rFonts w:ascii="微软雅黑" w:hAnsi="微软雅黑" w:eastAsia="微软雅黑"/>
+          <w:b w:val="0"/>
+          <w:color w:val="19232D"/>
+          <w:sz w:val="20"/>
+        </w:rPr>
+        <w:tab/>
+      </w:r>
+      <w:r>
+        <w:rPr>
+          <w:rFonts w:ascii="微软雅黑" w:hAnsi="微软雅黑" w:eastAsia="微软雅黑"/>
+          <w:b/>
+          <w:color w:val="19232D"/>
+          <w:sz w:val="20"/>
+        </w:rPr>
+        <w:t>评测与优化：</w:t>
+      </w:r>
+      <w:r>
+        <w:t>221 条工具路由回归 + 64 条语义评测 + 119 例视觉标注，据此定位并修复「含为什么的知识题被误判成单袋查询」的缺陷；重排熔断、向量超时退回关键词、大模型超时降级，端到端从 19.5 s 降到 3–5 s，模型可在本地 4B 与云端切换</w:t>
       </w:r>
     </w:p>
     <w:p>

</xml_diff>

<commit_message>
resume: keep two projects, note patent/copyright on 烟标, regenerate cv and PDFs
</commit_message>
<xml_diff>
--- a/resume/resume.docx
+++ b/resume/resume.docx
@@ -443,16 +443,7 @@
           <w:color w:val="19232D"/>
           <w:sz w:val="20"/>
         </w:rPr>
-        <w:t>软件著作权</w:t>
-      </w:r>
-      <w:r>
-        <w:rPr>
-          <w:rFonts w:ascii="微软雅黑" w:hAnsi="微软雅黑" w:eastAsia="微软雅黑"/>
-          <w:b w:val="0"/>
-          <w:color w:val="19232D"/>
-          <w:sz w:val="20"/>
-        </w:rPr>
-        <w:t xml:space="preserve"> 登记已受理 · 专利在审</w:t>
+        <w:t>软件著作权 登记已受理 · 专利在审（均基于烟标质检助手）</w:t>
       </w:r>
     </w:p>
     <w:p>
@@ -1081,226 +1072,6 @@
     <w:p>
       <w:pPr>
         <w:keepNext/>
-        <w:spacing w:before="120" w:after="40" w:line="276" w:lineRule="auto"/>
-      </w:pPr>
-      <w:r>
-        <w:rPr>
-          <w:rFonts w:ascii="微软雅黑" w:hAnsi="微软雅黑" w:eastAsia="微软雅黑"/>
-          <w:b/>
-          <w:color w:val="19232D"/>
-          <w:sz w:val="22"/>
-        </w:rPr>
-        <w:t>烟标质检助手 · HarmonyOS App（课题组校企合作 · 已通过真机验收）</w:t>
-      </w:r>
-      <w:r>
-        <w:rPr>
-          <w:rFonts w:ascii="微软雅黑" w:hAnsi="微软雅黑" w:eastAsia="微软雅黑"/>
-          <w:b/>
-          <w:color w:val="19232D"/>
-          <w:sz w:val="22"/>
-        </w:rPr>
-        <w:tab/>
-      </w:r>
-      <w:r>
-        <w:rPr>
-          <w:rFonts w:ascii="微软雅黑" w:hAnsi="微软雅黑" w:eastAsia="微软雅黑"/>
-          <w:b/>
-          <w:color w:val="19232D"/>
-          <w:sz w:val="22"/>
-        </w:rPr>
-        <w:t>2026.06 — 至今</w:t>
-      </w:r>
-    </w:p>
-    <w:p>
-      <w:pPr>
-        <w:spacing w:before="0" w:after="20" w:line="276" w:lineRule="auto"/>
-      </w:pPr>
-      <w:r>
-        <w:rPr>
-          <w:rFonts w:ascii="微软雅黑" w:hAnsi="微软雅黑" w:eastAsia="微软雅黑"/>
-          <w:b w:val="0"/>
-          <w:color w:val="19232D"/>
-          <w:sz w:val="20"/>
-        </w:rPr>
-        <w:t>烟标缺陷检测算法</w:t>
-      </w:r>
-      <w:r>
-        <w:rPr>
-          <w:rFonts w:hint="eastAsia" w:ascii="微软雅黑" w:hAnsi="微软雅黑" w:eastAsia="微软雅黑"/>
-          <w:b w:val="0"/>
-          <w:color w:val="19232D"/>
-          <w:sz w:val="20"/>
-          <w:lang w:val="en-US" w:eastAsia="zh-CN"/>
-        </w:rPr>
-        <w:t>的</w:t>
-      </w:r>
-      <w:r>
-        <w:rPr>
-          <w:rFonts w:ascii="微软雅黑" w:hAnsi="微软雅黑" w:eastAsia="微软雅黑"/>
-          <w:b w:val="0"/>
-          <w:color w:val="19232D"/>
-          <w:sz w:val="20"/>
-        </w:rPr>
-        <w:t>端侧质检应用</w:t>
-      </w:r>
-    </w:p>
-    <w:p>
-      <w:pPr>
-        <w:spacing w:before="0" w:after="20" w:line="276" w:lineRule="auto"/>
-      </w:pPr>
-      <w:r>
-        <w:rPr>
-          <w:rFonts w:ascii="微软雅黑" w:hAnsi="微软雅黑" w:eastAsia="微软雅黑"/>
-          <w:b w:val="0"/>
-          <w:color w:val="19232D"/>
-          <w:sz w:val="20"/>
-        </w:rPr>
-        <w:t>概述：负责鸿蒙端前端开发（ArkTS + ArkUI）与视觉算法开发；主导检测算法从 PC 端迁移到鸿蒙端并完成真机验收，端侧单张 11~75 s。</w:t>
-      </w:r>
-    </w:p>
-    <w:p>
-      <w:pPr>
-        <w:spacing w:before="0" w:after="40" w:line="276" w:lineRule="auto"/>
-      </w:pPr>
-      <w:r>
-        <w:rPr>
-          <w:rFonts w:ascii="微软雅黑" w:hAnsi="微软雅黑" w:eastAsia="微软雅黑"/>
-          <w:b w:val="0"/>
-          <w:color w:val="5C4ADC"/>
-          <w:sz w:val="19"/>
-        </w:rPr>
-        <w:t>技术栈：ArkTS、HarmonyOS、Native NAPI、C++、TaskPool、OpenCV 5.0、Excel  / FTP</w:t>
-      </w:r>
-    </w:p>
-    <w:p>
-      <w:pPr>
-        <w:spacing w:before="0" w:after="40" w:line="276" w:lineRule="auto"/>
-        <w:ind w:left="320" w:hanging="320"/>
-      </w:pPr>
-      <w:r>
-        <w:rPr>
-          <w:rFonts w:ascii="微软雅黑" w:hAnsi="微软雅黑" w:eastAsia="微软雅黑"/>
-          <w:b w:val="0"/>
-          <w:color w:val="19232D"/>
-          <w:sz w:val="20"/>
-        </w:rPr>
-        <w:t>•</w:t>
-      </w:r>
-      <w:r>
-        <w:rPr>
-          <w:rFonts w:ascii="微软雅黑" w:hAnsi="微软雅黑" w:eastAsia="微软雅黑"/>
-          <w:b w:val="0"/>
-          <w:color w:val="19232D"/>
-          <w:sz w:val="20"/>
-        </w:rPr>
-        <w:tab/>
-      </w:r>
-      <w:r>
-        <w:rPr>
-          <w:rFonts w:ascii="微软雅黑" w:hAnsi="微软雅黑" w:eastAsia="微软雅黑"/>
-          <w:b/>
-          <w:color w:val="19232D"/>
-          <w:sz w:val="20"/>
-        </w:rPr>
-        <w:t>端侧迁移与验收：</w:t>
-      </w:r>
-      <w:r>
-        <w:rPr>
-          <w:rFonts w:ascii="微软雅黑" w:hAnsi="微软雅黑" w:eastAsia="微软雅黑"/>
-          <w:b w:val="0"/>
-          <w:color w:val="19232D"/>
-          <w:sz w:val="20"/>
-        </w:rPr>
-        <w:t>按「测试集验证 → NAPI 链路打通 → C++ 全量移植 → 真机一致性验收」四阶段推进；建立 17 张真值图的测试集与缺陷级一致性判据（NCC 容差常规 ±0.03 / 难图 ±0.10），自动化验收通过，真机单张 11~75 s</w:t>
-      </w:r>
-    </w:p>
-    <w:p>
-      <w:pPr>
-        <w:spacing w:before="0" w:after="40" w:line="276" w:lineRule="auto"/>
-        <w:ind w:left="320" w:hanging="320"/>
-      </w:pPr>
-      <w:r>
-        <w:rPr>
-          <w:rFonts w:ascii="微软雅黑" w:hAnsi="微软雅黑" w:eastAsia="微软雅黑"/>
-          <w:b w:val="0"/>
-          <w:color w:val="19232D"/>
-          <w:sz w:val="20"/>
-        </w:rPr>
-        <w:t>•</w:t>
-      </w:r>
-      <w:r>
-        <w:rPr>
-          <w:rFonts w:ascii="微软雅黑" w:hAnsi="微软雅黑" w:eastAsia="微软雅黑"/>
-          <w:b w:val="0"/>
-          <w:color w:val="19232D"/>
-          <w:sz w:val="20"/>
-        </w:rPr>
-        <w:tab/>
-      </w:r>
-      <w:r>
-        <w:rPr>
-          <w:rFonts w:ascii="微软雅黑" w:hAnsi="微软雅黑" w:eastAsia="微软雅黑"/>
-          <w:b/>
-          <w:color w:val="19232D"/>
-          <w:sz w:val="20"/>
-        </w:rPr>
-        <w:t>检测能力与定量提升：</w:t>
-      </w:r>
-      <w:r>
-        <w:rPr>
-          <w:rFonts w:ascii="微软雅黑" w:hAnsi="微软雅黑" w:eastAsia="微软雅黑"/>
-          <w:b w:val="0"/>
-          <w:color w:val="19232D"/>
-          <w:sz w:val="20"/>
-        </w:rPr>
-        <w:t>9 级检测流水线覆盖文字行印刷、图标 Logo、烫金激凸套印与脏点污点四类场景，判据统一收敛到物理量纲（1 px ≈ 0.0495 mm、最小可检 0.5 mm）；以 ORB + RANSAC 单应性替代相位相关，跨样张对齐 NCC 由 0.445 提升至 0.686（+54%），轮廓提取与人工标注掩码 IoU 0.9968</w:t>
-      </w:r>
-    </w:p>
-    <w:p>
-      <w:pPr>
-        <w:spacing w:before="0" w:after="40" w:line="276" w:lineRule="auto"/>
-        <w:ind w:left="320" w:hanging="320"/>
-      </w:pPr>
-      <w:r>
-        <w:rPr>
-          <w:rFonts w:ascii="微软雅黑" w:hAnsi="微软雅黑" w:eastAsia="微软雅黑"/>
-          <w:b w:val="0"/>
-          <w:color w:val="19232D"/>
-          <w:sz w:val="20"/>
-        </w:rPr>
-        <w:t>•</w:t>
-      </w:r>
-      <w:r>
-        <w:rPr>
-          <w:rFonts w:ascii="微软雅黑" w:hAnsi="微软雅黑" w:eastAsia="微软雅黑"/>
-          <w:b w:val="0"/>
-          <w:color w:val="19232D"/>
-          <w:sz w:val="20"/>
-        </w:rPr>
-        <w:tab/>
-      </w:r>
-      <w:r>
-        <w:rPr>
-          <w:rFonts w:ascii="微软雅黑" w:hAnsi="微软雅黑" w:eastAsia="微软雅黑"/>
-          <w:b/>
-          <w:color w:val="19232D"/>
-          <w:sz w:val="20"/>
-        </w:rPr>
-        <w:t>端侧工程与算法库化：</w:t>
-      </w:r>
-      <w:r>
-        <w:rPr>
-          <w:rFonts w:ascii="微软雅黑" w:hAnsi="微软雅黑" w:eastAsia="微软雅黑"/>
-          <w:b w:val="0"/>
-          <w:color w:val="19232D"/>
-          <w:sz w:val="20"/>
-        </w:rPr>
-        <w:t>OpenCV 5.0 静态编译进 HAP（arm64-v8a / x86_64），检测经 TaskPool 异步执行避免阻塞 UI，支持管理员 / 操作员权限与按天 Excel 报表 FTP 上传；六套检测方法封装为自包含 Python 类，与原始工程逐值核对一致</w:t>
-      </w:r>
-    </w:p>
-    <w:p>
-      <w:pPr>
-        <w:keepNext/>
         <w:spacing w:before="200" w:after="80" w:line="276" w:lineRule="auto"/>
       </w:pPr>
       <w:r>

</xml_diff>

<commit_message>
fix(resume): make AI layer bullet title bold
</commit_message>
<xml_diff>
--- a/resume/resume.docx
+++ b/resume/resume.docx
@@ -967,31 +967,16 @@
         <w:ind w:left="320" w:hanging="320"/>
       </w:pPr>
       <w:r>
-        <w:rPr>
-          <w:rFonts w:ascii="微软雅黑" w:hAnsi="微软雅黑" w:eastAsia="微软雅黑"/>
-          <w:b w:val="0"/>
-          <w:color w:val="19232D"/>
-          <w:sz w:val="20"/>
-        </w:rPr>
         <w:t>•</w:t>
       </w:r>
       <w:r>
-        <w:rPr>
-          <w:rFonts w:ascii="微软雅黑" w:hAnsi="微软雅黑" w:eastAsia="微软雅黑"/>
-          <w:b w:val="0"/>
-          <w:color w:val="19232D"/>
-          <w:sz w:val="20"/>
-        </w:rPr>
         <w:tab/>
       </w:r>
       <w:r>
         <w:rPr>
-          <w:rFonts w:ascii="微软雅黑" w:hAnsi="微软雅黑" w:eastAsia="微软雅黑"/>
           <w:b/>
-          <w:color w:val="19232D"/>
-          <w:sz w:val="20"/>
         </w:rPr>
-        <w:t>AI 层（工具型 Agent + RAG）：</w:t>
+        <w:t>AI 层（Agent+RAG）：</w:t>
       </w:r>
       <w:r>
         <w:t>不改动原有相机 / 算法 / PLC，在旁边加独立 AI 应用层；八个工具覆盖单袋查询、按结果筛选、按测量值排序、超出阈值比例排序（找最接近合格的 NG）、原因分布、班次对比、连续同原因 NG 检测与知识检索，先判断「问一袋还是问一批」再选工具</w:t>

</xml_diff>

<commit_message>
resume: one-page version without VLM positioning
</commit_message>
<xml_diff>
--- a/resume/resume.docx
+++ b/resume/resume.docx
@@ -27,7 +27,7 @@
           <w:color w:val="5A6470"/>
           <w:sz w:val="21"/>
         </w:rPr>
-        <w:t>求职意向：AI 全栈 / AI 应用 / 多模态（VLM）· 计算机视觉算法</w:t>
+        <w:t>求职意向：AI 全栈 / AI 应用 · 计算机视觉算法</w:t>
       </w:r>
     </w:p>
     <w:p>
@@ -41,7 +41,7 @@
           <w:color w:val="19232D"/>
           <w:sz w:val="21"/>
         </w:rPr>
-        <w:t>专注计算机视觉与 AI 应用的工程落地：目标检测、图像量测、工业质检，以及工具型 Agent 与多模态应用。</w:t>
+        <w:t>专注 AI 应用与计算机视觉的工程落地：工具型 Agent、检索增强，以及工业视觉检测。</w:t>
       </w:r>
     </w:p>
     <w:p>
@@ -145,20 +145,6 @@
     </w:p>
     <w:p>
       <w:pPr>
-        <w:spacing w:before="0" w:after="40" w:line="276" w:lineRule="auto"/>
-      </w:pPr>
-      <w:r>
-        <w:rPr>
-          <w:rFonts w:ascii="微软雅黑" w:hAnsi="微软雅黑" w:eastAsia="微软雅黑"/>
-          <w:b w:val="0"/>
-          <w:color w:val="19232D"/>
-          <w:sz w:val="20"/>
-        </w:rPr>
-        <w:t>主修课程：深度学习、数字图像处理、机器学习、模式识别、线性代数、离散数学、程序设计（C++）、数据结构、操作系统、计算机体系结构、计算机网络、计算机系统等</w:t>
-      </w:r>
-    </w:p>
-    <w:p>
-      <w:pPr>
         <w:keepNext/>
         <w:spacing w:before="200" w:after="80" w:line="276" w:lineRule="auto"/>
       </w:pPr>
@@ -211,7 +197,7 @@
           <w:color w:val="19232D"/>
           <w:sz w:val="20"/>
         </w:rPr>
-        <w:t>编程语言：Python、C++、ArkTS</w:t>
+        <w:t>编程语言与工程：Python、C++、ArkTS、PyQt5、Git、PyInstaller、pyserial（Modbus RTU）</w:t>
       </w:r>
     </w:p>
     <w:p>
@@ -225,7 +211,7 @@
           <w:color w:val="19232D"/>
           <w:sz w:val="20"/>
         </w:rPr>
-        <w:t>端侧与并行计算：HarmonyOS / ArkTS、Native NAPI、MPI、Kokkos、HIP / DCU、Linux / Slurm</w:t>
+        <w:t>端侧与并行：HarmonyOS / NAPI、MPI、Kokkos、HIP / DCU</w:t>
       </w:r>
     </w:p>
     <w:p>
@@ -239,21 +225,7 @@
           <w:color w:val="19232D"/>
           <w:sz w:val="20"/>
         </w:rPr>
-        <w:t>工程化与工具链：PyQt5、Git、PyInstaller、pyserial（Modbus RTU）、多线程 / 队列、工业相机 SDK（MVS）</w:t>
-      </w:r>
-    </w:p>
-    <w:p>
-      <w:pPr>
-        <w:spacing w:before="0" w:after="20" w:line="276" w:lineRule="auto"/>
-      </w:pPr>
-      <w:r>
-        <w:rPr>
-          <w:rFonts w:ascii="微软雅黑" w:hAnsi="微软雅黑" w:eastAsia="微软雅黑"/>
-          <w:b w:val="0"/>
-          <w:color w:val="19232D"/>
-          <w:sz w:val="20"/>
-        </w:rPr>
-        <w:t>大模型与检索：RAG（检索增强生成）、向量检索、Rerank、工具调用 / Agent 编排、FastAPI、多模态（VLM）、评测体系</w:t>
+        <w:t>大模型与检索：RAG（检索增强生成）、向量检索、Rerank、工具调用 / Agent 编排、FastAPI、评测体系</w:t>
       </w:r>
     </w:p>
     <w:p>
@@ -315,89 +287,6 @@
           <w:sz w:val="20"/>
         </w:rPr>
         <w:t>三等奖</w:t>
-      </w:r>
-    </w:p>
-    <w:p>
-      <w:pPr>
-        <w:spacing w:before="0" w:after="20" w:line="276" w:lineRule="auto"/>
-      </w:pPr>
-      <w:r>
-        <w:rPr>
-          <w:rFonts w:ascii="微软雅黑" w:hAnsi="微软雅黑" w:eastAsia="微软雅黑"/>
-          <w:b w:val="0"/>
-          <w:color w:val="19232D"/>
-          <w:sz w:val="20"/>
-        </w:rPr>
-        <w:t xml:space="preserve">2026 湖南大学新文科实践创新大赛 </w:t>
-      </w:r>
-      <w:r>
-        <w:rPr>
-          <w:rFonts w:ascii="微软雅黑" w:hAnsi="微软雅黑" w:eastAsia="微软雅黑"/>
-          <w:b/>
-          <w:color w:val="19232D"/>
-          <w:sz w:val="20"/>
-        </w:rPr>
-        <w:t>校级铜奖</w:t>
-      </w:r>
-    </w:p>
-    <w:p>
-      <w:pPr>
-        <w:spacing w:before="0" w:after="20" w:line="276" w:lineRule="auto"/>
-      </w:pPr>
-      <w:r>
-        <w:rPr>
-          <w:rFonts w:ascii="微软雅黑" w:hAnsi="微软雅黑" w:eastAsia="微软雅黑"/>
-          <w:b w:val="0"/>
-          <w:color w:val="19232D"/>
-          <w:sz w:val="20"/>
-        </w:rPr>
-        <w:t xml:space="preserve">第十九届“挑战杯” </w:t>
-      </w:r>
-      <w:r>
-        <w:rPr>
-          <w:rFonts w:ascii="微软雅黑" w:hAnsi="微软雅黑" w:eastAsia="微软雅黑"/>
-          <w:b/>
-          <w:color w:val="19232D"/>
-          <w:sz w:val="20"/>
-        </w:rPr>
-        <w:t>校赛三等奖</w:t>
-      </w:r>
-    </w:p>
-    <w:p>
-      <w:pPr>
-        <w:spacing w:before="0" w:after="20" w:line="276" w:lineRule="auto"/>
-      </w:pPr>
-      <w:r>
-        <w:rPr>
-          <w:rFonts w:ascii="微软雅黑" w:hAnsi="微软雅黑" w:eastAsia="微软雅黑"/>
-          <w:b w:val="0"/>
-          <w:color w:val="19232D"/>
-          <w:sz w:val="20"/>
-        </w:rPr>
-        <w:t>2025—2026 年度优秀志愿者（志愿时长 150 小时）</w:t>
-      </w:r>
-    </w:p>
-    <w:p>
-      <w:pPr>
-        <w:spacing w:before="0" w:after="20" w:line="276" w:lineRule="auto"/>
-      </w:pPr>
-      <w:r>
-        <w:rPr>
-          <w:rFonts w:ascii="微软雅黑" w:hAnsi="微软雅黑" w:eastAsia="微软雅黑"/>
-          <w:b w:val="0"/>
-          <w:color w:val="19232D"/>
-          <w:sz w:val="20"/>
-        </w:rPr>
-        <w:t xml:space="preserve">大学英语六级考试 </w:t>
-      </w:r>
-      <w:r>
-        <w:rPr>
-          <w:rFonts w:ascii="微软雅黑" w:hAnsi="微软雅黑" w:eastAsia="微软雅黑"/>
-          <w:b/>
-          <w:color w:val="19232D"/>
-          <w:sz w:val="20"/>
-        </w:rPr>
-        <w:t>CET-6 通过</w:t>
       </w:r>
     </w:p>
     <w:p>
@@ -549,33 +438,8 @@
           <w:sz w:val="20"/>
         </w:rPr>
         <w:t>•</w:t>
-      </w:r>
-      <w:r>
-        <w:rPr>
-          <w:rFonts w:ascii="微软雅黑" w:hAnsi="微软雅黑" w:eastAsia="微软雅黑"/>
-          <w:b w:val="0"/>
-          <w:color w:val="19232D"/>
-          <w:sz w:val="20"/>
-        </w:rPr>
         <w:tab/>
-      </w:r>
-      <w:r>
-        <w:rPr>
-          <w:rFonts w:ascii="微软雅黑" w:hAnsi="微软雅黑" w:eastAsia="微软雅黑"/>
-          <w:b/>
-          <w:color w:val="19232D"/>
-          <w:sz w:val="20"/>
-        </w:rPr>
-        <w:t>检测与实时推理调度：</w:t>
-      </w:r>
-      <w:r>
-        <w:rPr>
-          <w:rFonts w:ascii="微软雅黑" w:hAnsi="微软雅黑" w:eastAsia="微软雅黑"/>
-          <w:b w:val="0"/>
-          <w:color w:val="19232D"/>
-          <w:sz w:val="20"/>
-        </w:rPr>
-        <w:t>YOLOv8 单类人员检测（自训模型），2–4 路 1280×720 工业相机并发；推理按「只保留最新帧 + 轮询公平调度 + batch=1」组织，不等待凑批；以 ModelFactory 统一 backend 协议，可在 PyTorch（CUDA / CPU）、ONNXRuntime、算能 Sophon NPU 之间切换</w:t>
+        <w:t>检测与实时推理调度：YOLOv8 单类人员检测（自训），2–4 路 1280×720 相机并发；按「只留最新帧 + 轮询公平调度 + batch=1」组织，避免旧帧堆积与某一路被饿死</w:t>
       </w:r>
     </w:p>
     <w:p>
@@ -591,117 +455,8 @@
           <w:sz w:val="20"/>
         </w:rPr>
         <w:t>•</w:t>
-      </w:r>
-      <w:r>
-        <w:rPr>
-          <w:rFonts w:ascii="微软雅黑" w:hAnsi="微软雅黑" w:eastAsia="微软雅黑"/>
-          <w:b w:val="0"/>
-          <w:color w:val="19232D"/>
-          <w:sz w:val="20"/>
-        </w:rPr>
         <w:tab/>
-      </w:r>
-      <w:r>
-        <w:rPr>
-          <w:rFonts w:ascii="微软雅黑" w:hAnsi="微软雅黑" w:eastAsia="微软雅黑"/>
-          <w:b/>
-          <w:color w:val="19232D"/>
-          <w:sz w:val="20"/>
-        </w:rPr>
-        <w:t>区域与方向判定：</w:t>
-      </w:r>
-      <w:r>
-        <w:rPr>
-          <w:rFonts w:ascii="微软雅黑" w:hAnsi="微软雅黑" w:eastAsia="微软雅黑"/>
-          <w:b w:val="0"/>
-          <w:color w:val="19232D"/>
-          <w:sz w:val="20"/>
-        </w:rPr>
-        <w:t>多边形 ROI 划分 ON / IN / OUT 三区，门区短轨迹状态机按位移投影判定 ENTER / LEAVE，对检测抖动与丢帧容错，输出设备内实时人数与进出净流量</w:t>
-      </w:r>
-    </w:p>
-    <w:p>
-      <w:pPr>
-        <w:spacing w:before="0" w:after="40" w:line="276" w:lineRule="auto"/>
-        <w:ind w:left="320" w:hanging="320"/>
-      </w:pPr>
-      <w:r>
-        <w:rPr>
-          <w:rFonts w:ascii="微软雅黑" w:hAnsi="微软雅黑" w:eastAsia="微软雅黑"/>
-          <w:b w:val="0"/>
-          <w:color w:val="19232D"/>
-          <w:sz w:val="20"/>
-        </w:rPr>
-        <w:t>•</w:t>
-      </w:r>
-      <w:r>
-        <w:rPr>
-          <w:rFonts w:ascii="微软雅黑" w:hAnsi="微软雅黑" w:eastAsia="微软雅黑"/>
-          <w:b w:val="0"/>
-          <w:color w:val="19232D"/>
-          <w:sz w:val="20"/>
-        </w:rPr>
-        <w:tab/>
-      </w:r>
-      <w:r>
-        <w:rPr>
-          <w:rFonts w:ascii="微软雅黑" w:hAnsi="微软雅黑" w:eastAsia="微软雅黑"/>
-          <w:b/>
-          <w:color w:val="19232D"/>
-          <w:sz w:val="20"/>
-        </w:rPr>
-        <w:t>Fail-Safe 安全设计：</w:t>
-      </w:r>
-      <w:r>
-        <w:rPr>
-          <w:rFonts w:ascii="微软雅黑" w:hAnsi="微软雅黑" w:eastAsia="微软雅黑"/>
-          <w:b w:val="0"/>
-          <w:color w:val="19232D"/>
-          <w:sz w:val="20"/>
-        </w:rPr>
-        <w:t>STARTUP / PERSON / FAULT LOCK 状态机——启动默认锁机、检测到人保持锁机、任一模块心跳超时即判故障并强制锁机；复位需同时满足「无人 + 无故障 + 模块健康」并在执行前二次复查</w:t>
-      </w:r>
-    </w:p>
-    <w:p>
-      <w:pPr>
-        <w:spacing w:before="0" w:after="40" w:line="276" w:lineRule="auto"/>
-        <w:ind w:left="320" w:hanging="320"/>
-      </w:pPr>
-      <w:r>
-        <w:rPr>
-          <w:rFonts w:ascii="微软雅黑" w:hAnsi="微软雅黑" w:eastAsia="微软雅黑"/>
-          <w:b w:val="0"/>
-          <w:color w:val="19232D"/>
-          <w:sz w:val="20"/>
-        </w:rPr>
-        <w:t>•</w:t>
-      </w:r>
-      <w:r>
-        <w:rPr>
-          <w:rFonts w:ascii="微软雅黑" w:hAnsi="微软雅黑" w:eastAsia="微软雅黑"/>
-          <w:b w:val="0"/>
-          <w:color w:val="19232D"/>
-          <w:sz w:val="20"/>
-        </w:rPr>
-        <w:tab/>
-      </w:r>
-      <w:r>
-        <w:rPr>
-          <w:rFonts w:ascii="微软雅黑" w:hAnsi="微软雅黑" w:eastAsia="微软雅黑"/>
-          <w:b/>
-          <w:color w:val="19232D"/>
-          <w:sz w:val="20"/>
-        </w:rPr>
-        <w:t>时延验收与工控联锁：</w:t>
-      </w:r>
-      <w:r>
-        <w:rPr>
-          <w:rFonts w:ascii="微软雅黑" w:hAnsi="微软雅黑" w:eastAsia="微软雅黑"/>
-          <w:b w:val="0"/>
-          <w:color w:val="19232D"/>
-          <w:sz w:val="20"/>
-        </w:rPr>
-        <w:t>端到端以 T0 相机取帧 → T1 继电器写入成功 ≤ 200 ms 为验收口径，拆成 acquire / scheduler / infer / rule / safety / io 六段统计 p95 / p99；锁机经 Modbus RTU 输出并保留 DI 软复位，IO 侧 3 次重试 + 死信队列 + 紧急锁机回调</w:t>
+        <w:t>Fail-Safe 与时延：启动默认锁机、检测到人保持锁机、心跳超时即强制锁机，复位需「无人 + 无故障 + 模块健康」；端到端 T0 取帧 → T1 继电器 ≤ 200 ms，拆六段统计 p95 / p99</w:t>
       </w:r>
     </w:p>
     <w:p>
@@ -790,7 +545,7 @@
           <w:color w:val="5C4ADC"/>
           <w:sz w:val="19"/>
         </w:rPr>
-        <w:t>技术栈：Python、OpenCV、NumPy、PyQt5、多线程 / 队列、pyserial（Modbus RTU）、C SDK 封装（ctypes）、PyInstaller、FastAPI、RAG、VLM</w:t>
+        <w:t>技术栈：Python、OpenCV、NumPy、PyQt5、多线程 / 队列、pyserial（Modbus RTU）、PyInstaller、FastAPI、RAG</w:t>
       </w:r>
     </w:p>
     <w:p>
@@ -799,166 +554,19 @@
         <w:ind w:left="320" w:hanging="320"/>
       </w:pPr>
       <w:r>
-        <w:rPr>
-          <w:rFonts w:ascii="微软雅黑" w:hAnsi="微软雅黑" w:eastAsia="微软雅黑"/>
-          <w:b w:val="0"/>
-          <w:color w:val="19232D"/>
-          <w:sz w:val="20"/>
-        </w:rPr>
         <w:t>•</w:t>
       </w:r>
       <w:r>
-        <w:rPr>
-          <w:rFonts w:ascii="微软雅黑" w:hAnsi="微软雅黑" w:eastAsia="微软雅黑"/>
-          <w:b w:val="0"/>
-          <w:color w:val="19232D"/>
-          <w:sz w:val="20"/>
-        </w:rPr>
         <w:tab/>
       </w:r>
       <w:r>
         <w:rPr>
-          <w:rFonts w:ascii="微软雅黑" w:hAnsi="微软雅黑" w:eastAsia="微软雅黑"/>
           <w:b/>
-          <w:color w:val="19232D"/>
-          <w:sz w:val="20"/>
         </w:rPr>
-        <w:t>图像算法链路（可见光）：</w:t>
+        <w:t>双路算法与融合：</w:t>
       </w:r>
       <w:r>
-        <w:rPr>
-          <w:rFonts w:ascii="微软雅黑" w:hAnsi="微软雅黑" w:eastAsia="微软雅黑"/>
-          <w:b w:val="0"/>
-          <w:color w:val="19232D"/>
-          <w:sz w:val="20"/>
-        </w:rPr>
-        <w:t>4 项加权边缘得分图 → 动态规划求全局最优连续边缘 → 确定性 RANSAC 拟合基准线（内点率 / 覆盖率 / 残差 / 倾角四重质量门）→ 缺陷候选统一判废 + 重叠面积去重</w:t>
-      </w:r>
-    </w:p>
-    <w:p>
-      <w:pPr>
-        <w:spacing w:before="0" w:after="40" w:line="276" w:lineRule="auto"/>
-        <w:ind w:left="320" w:hanging="320"/>
-      </w:pPr>
-      <w:r>
-        <w:rPr>
-          <w:rFonts w:ascii="微软雅黑" w:hAnsi="微软雅黑" w:eastAsia="微软雅黑"/>
-          <w:b w:val="0"/>
-          <w:color w:val="19232D"/>
-          <w:sz w:val="20"/>
-        </w:rPr>
-        <w:t>•</w:t>
-      </w:r>
-      <w:r>
-        <w:rPr>
-          <w:rFonts w:ascii="微软雅黑" w:hAnsi="微软雅黑" w:eastAsia="微软雅黑"/>
-          <w:b w:val="0"/>
-          <w:color w:val="19232D"/>
-          <w:sz w:val="20"/>
-        </w:rPr>
-        <w:tab/>
-      </w:r>
-      <w:r>
-        <w:rPr>
-          <w:rFonts w:ascii="微软雅黑" w:hAnsi="微软雅黑" w:eastAsia="微软雅黑"/>
-          <w:b/>
-          <w:color w:val="19232D"/>
-          <w:sz w:val="20"/>
-        </w:rPr>
-        <w:t>图像算法链路（红外）：</w:t>
-      </w:r>
-      <w:r>
-        <w:rPr>
-          <w:rFonts w:ascii="微软雅黑" w:hAnsi="微软雅黑" w:eastAsia="微软雅黑"/>
-          <w:b w:val="0"/>
-          <w:color w:val="19232D"/>
-          <w:sz w:val="20"/>
-        </w:rPr>
-        <w:t>自适应温度分割 → 连通域打分与结构精化 → 逐列几何测量 → 局部形变检测（短窗−长窗中值残差 + 播种扩张）→ 异物检测（局部温度参考 + MAD 稳健阈值）</w:t>
-      </w:r>
-    </w:p>
-    <w:p>
-      <w:pPr>
-        <w:spacing w:before="0" w:after="40" w:line="276" w:lineRule="auto"/>
-        <w:ind w:left="320" w:hanging="320"/>
-      </w:pPr>
-      <w:r>
-        <w:rPr>
-          <w:rFonts w:ascii="微软雅黑" w:hAnsi="微软雅黑" w:eastAsia="微软雅黑"/>
-          <w:b w:val="0"/>
-          <w:color w:val="19232D"/>
-          <w:sz w:val="20"/>
-        </w:rPr>
-        <w:t>•</w:t>
-      </w:r>
-      <w:r>
-        <w:rPr>
-          <w:rFonts w:ascii="微软雅黑" w:hAnsi="微软雅黑" w:eastAsia="微软雅黑"/>
-          <w:b w:val="0"/>
-          <w:color w:val="19232D"/>
-          <w:sz w:val="20"/>
-        </w:rPr>
-        <w:tab/>
-      </w:r>
-      <w:r>
-        <w:rPr>
-          <w:rFonts w:ascii="微软雅黑" w:hAnsi="微软雅黑" w:eastAsia="微软雅黑"/>
-          <w:b/>
-          <w:color w:val="19232D"/>
-          <w:sz w:val="20"/>
-        </w:rPr>
-        <w:t>多源决策与可靠性：</w:t>
-      </w:r>
-      <w:r>
-        <w:rPr>
-          <w:rFonts w:ascii="微软雅黑" w:hAnsi="微软雅黑" w:eastAsia="微软雅黑"/>
-          <w:b w:val="0"/>
-          <w:color w:val="19232D"/>
-          <w:sz w:val="20"/>
-        </w:rPr>
-        <w:t>IR 温度矩阵 + RGB 可见光由 PLC 硬触发同帧采集、纳秒戳配对（±100 ms）；OK / NG / UNKNOWN 三态 Fail-Safe，任一路异常降级为「不可信」而非误放行</w:t>
-      </w:r>
-    </w:p>
-    <w:p>
-      <w:pPr>
-        <w:spacing w:before="0" w:after="40" w:line="276" w:lineRule="auto"/>
-        <w:ind w:left="320" w:hanging="320"/>
-      </w:pPr>
-      <w:r>
-        <w:rPr>
-          <w:rFonts w:ascii="微软雅黑" w:hAnsi="微软雅黑" w:eastAsia="微软雅黑"/>
-          <w:b w:val="0"/>
-          <w:color w:val="19232D"/>
-          <w:sz w:val="20"/>
-        </w:rPr>
-        <w:t>•</w:t>
-      </w:r>
-      <w:r>
-        <w:rPr>
-          <w:rFonts w:ascii="微软雅黑" w:hAnsi="微软雅黑" w:eastAsia="微软雅黑"/>
-          <w:b w:val="0"/>
-          <w:color w:val="19232D"/>
-          <w:sz w:val="20"/>
-        </w:rPr>
-        <w:tab/>
-      </w:r>
-      <w:r>
-        <w:rPr>
-          <w:rFonts w:ascii="微软雅黑" w:hAnsi="微软雅黑" w:eastAsia="微软雅黑"/>
-          <w:b/>
-          <w:color w:val="19232D"/>
-          <w:sz w:val="20"/>
-        </w:rPr>
-        <w:t>评测闭环与工程落地：</w:t>
-      </w:r>
-      <w:r>
-        <w:rPr>
-          <w:rFonts w:ascii="微软雅黑" w:hAnsi="微软雅黑" w:eastAsia="微软雅黑"/>
-          <w:b w:val="0"/>
-          <w:color w:val="19232D"/>
-          <w:sz w:val="20"/>
-        </w:rPr>
-        <w:t>判定阈值全配置化热更新，配置持久化 SHA256 指纹 + 离线批量回归工具，保证「同图同结论」；多线程队列流水线（线程池存图、相机健康度重连、PLC 故障自动停机）支撑产线连续运行</w:t>
+        <w:t>可见光侧 DP 求最优边缘 + 确定性 RANSAC 拟合基准线（四重质量门）；红外侧自适应温度分割、逐列几何量测、MAD 稳健异物检测；双相机 PLC 硬触发同帧、纳秒戳配对，OK/NG/UNKNOWN 三态 Fail-Safe</w:t>
       </w:r>
     </w:p>
     <w:p>
@@ -979,7 +587,7 @@
         <w:t>AI 层（Agent+RAG）：</w:t>
       </w:r>
       <w:r>
-        <w:t>不改动原有相机 / 算法 / PLC，在旁边加独立 AI 应用层；八个工具覆盖单袋查询、按结果筛选、按测量值排序、超出阈值比例排序（找最接近合格的 NG）、原因分布、班次对比、连续同原因 NG 检测与知识检索，先判断「问一袋还是问一批」再选工具</w:t>
+        <w:t>不改原有相机/算法/PLC，旁边加独立 AI 应用层；八工具覆盖单袋查询、按结果筛选、按测量值排序、最接近合格排序、原因分布、班次对比、连续 NG、知识检索；混合检索带引用、证据不足明确拒答（9/9）</w:t>
       </w:r>
     </w:p>
     <w:p>
@@ -988,70 +596,19 @@
         <w:ind w:left="320" w:hanging="320"/>
       </w:pPr>
       <w:r>
-        <w:rPr>
-          <w:rFonts w:ascii="微软雅黑" w:hAnsi="微软雅黑" w:eastAsia="微软雅黑"/>
-          <w:b w:val="0"/>
-          <w:color w:val="19232D"/>
-          <w:sz w:val="20"/>
-        </w:rPr>
         <w:t>•</w:t>
       </w:r>
       <w:r>
-        <w:rPr>
-          <w:rFonts w:ascii="微软雅黑" w:hAnsi="微软雅黑" w:eastAsia="微软雅黑"/>
-          <w:b w:val="0"/>
-          <w:color w:val="19232D"/>
-          <w:sz w:val="20"/>
-        </w:rPr>
         <w:tab/>
       </w:r>
       <w:r>
         <w:rPr>
-          <w:rFonts w:ascii="微软雅黑" w:hAnsi="微软雅黑" w:eastAsia="微软雅黑"/>
           <w:b/>
-          <w:color w:val="19232D"/>
-          <w:sz w:val="20"/>
         </w:rPr>
-        <w:t>检索与边界：</w:t>
+        <w:t>评测与工程：</w:t>
       </w:r>
       <w:r>
-        <w:t>BM25 与向量按 0.6 / 0.4 融合后重排取前 5，答案必须带出处；不可答题 9 条全部正确拒答；视觉模型只允许判断有没有露出银边，禁止评价褶皱与工艺参数，119 例人工标注上越界 0 例</w:t>
-      </w:r>
-    </w:p>
-    <w:p>
-      <w:pPr>
-        <w:spacing w:before="0" w:after="40" w:line="276" w:lineRule="auto"/>
-        <w:ind w:left="320" w:hanging="320"/>
-      </w:pPr>
-      <w:r>
-        <w:rPr>
-          <w:rFonts w:ascii="微软雅黑" w:hAnsi="微软雅黑" w:eastAsia="微软雅黑"/>
-          <w:b w:val="0"/>
-          <w:color w:val="19232D"/>
-          <w:sz w:val="20"/>
-        </w:rPr>
-        <w:t>•</w:t>
-      </w:r>
-      <w:r>
-        <w:rPr>
-          <w:rFonts w:ascii="微软雅黑" w:hAnsi="微软雅黑" w:eastAsia="微软雅黑"/>
-          <w:b w:val="0"/>
-          <w:color w:val="19232D"/>
-          <w:sz w:val="20"/>
-        </w:rPr>
-        <w:tab/>
-      </w:r>
-      <w:r>
-        <w:rPr>
-          <w:rFonts w:ascii="微软雅黑" w:hAnsi="微软雅黑" w:eastAsia="微软雅黑"/>
-          <w:b/>
-          <w:color w:val="19232D"/>
-          <w:sz w:val="20"/>
-        </w:rPr>
-        <w:t>评测与优化：</w:t>
-      </w:r>
-      <w:r>
-        <w:t>221 条工具路由回归 + 64 条语义评测 + 119 例视觉标注，据此定位并修复「含为什么的知识题被误判成单袋查询」的缺陷；重排熔断、向量超时退回关键词、大模型超时降级，端到端从 19.5 s 降到 3–5 s，模型可在本地 4B 与云端切换</w:t>
+        <w:t>221 条工具回归 + 64 条语义 + 119 例视觉标注，据此修复「含为什么的知识题被误判成单袋查询」；重排熔断与超时降级，端到端 19.5 s → 3–5 s</w:t>
       </w:r>
     </w:p>
     <w:p>
@@ -1114,143 +671,6 @@
           <w:sz w:val="20"/>
         </w:rPr>
         <w:t>大二进组 · 计算机视觉方向</w:t>
-      </w:r>
-    </w:p>
-    <w:p>
-      <w:pPr>
-        <w:spacing w:before="0" w:after="40" w:line="276" w:lineRule="auto"/>
-        <w:ind w:left="320" w:hanging="320"/>
-      </w:pPr>
-      <w:r>
-        <w:rPr>
-          <w:rFonts w:ascii="微软雅黑" w:hAnsi="微软雅黑" w:eastAsia="微软雅黑"/>
-          <w:b w:val="0"/>
-          <w:color w:val="19232D"/>
-          <w:sz w:val="20"/>
-        </w:rPr>
-        <w:t>•</w:t>
-      </w:r>
-      <w:r>
-        <w:rPr>
-          <w:rFonts w:ascii="微软雅黑" w:hAnsi="微软雅黑" w:eastAsia="微软雅黑"/>
-          <w:b w:val="0"/>
-          <w:color w:val="19232D"/>
-          <w:sz w:val="20"/>
-        </w:rPr>
-        <w:tab/>
-      </w:r>
-      <w:r>
-        <w:rPr>
-          <w:rFonts w:ascii="微软雅黑" w:hAnsi="微软雅黑" w:eastAsia="微软雅黑"/>
-          <w:b w:val="0"/>
-          <w:color w:val="19232D"/>
-          <w:sz w:val="20"/>
-        </w:rPr>
-        <w:t>大二起跟随导师进入科研组学习计算机视觉，从图像预处理、配准与量测做起，逐步独立承担课题中的算法实现与实验评估</w:t>
-      </w:r>
-    </w:p>
-    <w:p>
-      <w:pPr>
-        <w:spacing w:before="0" w:after="40" w:line="276" w:lineRule="auto"/>
-        <w:ind w:left="320" w:hanging="320"/>
-        <w:rPr>
-          <w:rFonts w:hint="eastAsia" w:eastAsia="微软雅黑"/>
-          <w:lang w:eastAsia="zh-CN"/>
-        </w:rPr>
-      </w:pPr>
-      <w:r>
-        <w:rPr>
-          <w:rFonts w:ascii="微软雅黑" w:hAnsi="微软雅黑" w:eastAsia="微软雅黑"/>
-          <w:b w:val="0"/>
-          <w:color w:val="19232D"/>
-          <w:sz w:val="20"/>
-        </w:rPr>
-        <w:t>•</w:t>
-      </w:r>
-      <w:r>
-        <w:rPr>
-          <w:rFonts w:ascii="微软雅黑" w:hAnsi="微软雅黑" w:eastAsia="微软雅黑"/>
-          <w:b w:val="0"/>
-          <w:color w:val="19232D"/>
-          <w:sz w:val="20"/>
-        </w:rPr>
-        <w:tab/>
-      </w:r>
-      <w:r>
-        <w:rPr>
-          <w:rFonts w:ascii="微软雅黑" w:hAnsi="微软雅黑" w:eastAsia="微软雅黑"/>
-          <w:b w:val="0"/>
-          <w:color w:val="19232D"/>
-          <w:sz w:val="20"/>
-        </w:rPr>
-        <w:t>由导师带领与企业合作完成「工业包装袋封口质量在线检测系统」与「无人车间的安全防护系统」两个项目：</w:t>
-      </w:r>
-      <w:r>
-        <w:rPr>
-          <w:rFonts w:hint="eastAsia" w:ascii="微软雅黑" w:hAnsi="微软雅黑" w:eastAsia="微软雅黑"/>
-          <w:b w:val="0"/>
-          <w:color w:val="19232D"/>
-          <w:sz w:val="20"/>
-          <w:lang w:val="en-US" w:eastAsia="zh-CN"/>
-        </w:rPr>
-        <w:t>独立完成</w:t>
-      </w:r>
-      <w:r>
-        <w:rPr>
-          <w:rFonts w:ascii="微软雅黑" w:hAnsi="微软雅黑" w:eastAsia="微软雅黑"/>
-          <w:b w:val="0"/>
-          <w:color w:val="19232D"/>
-          <w:sz w:val="20"/>
-        </w:rPr>
-        <w:t>「</w:t>
-      </w:r>
-      <w:r>
-        <w:rPr>
-          <w:rFonts w:hint="eastAsia" w:ascii="微软雅黑" w:hAnsi="微软雅黑" w:eastAsia="微软雅黑"/>
-          <w:b w:val="0"/>
-          <w:color w:val="19232D"/>
-          <w:sz w:val="20"/>
-          <w:lang w:val="en-US" w:eastAsia="zh-CN"/>
-        </w:rPr>
-        <w:t>烟标质检助手</w:t>
-      </w:r>
-      <w:r>
-        <w:rPr>
-          <w:rFonts w:ascii="微软雅黑" w:hAnsi="微软雅黑" w:eastAsia="微软雅黑"/>
-          <w:b w:val="0"/>
-          <w:color w:val="19232D"/>
-          <w:sz w:val="20"/>
-        </w:rPr>
-        <w:t>」</w:t>
-      </w:r>
-      <w:r>
-        <w:rPr>
-          <w:rFonts w:hint="eastAsia" w:ascii="微软雅黑" w:hAnsi="微软雅黑" w:eastAsia="微软雅黑"/>
-          <w:b w:val="0"/>
-          <w:color w:val="19232D"/>
-          <w:sz w:val="20"/>
-          <w:lang w:val="en-US" w:eastAsia="zh-CN"/>
-        </w:rPr>
-        <w:t>app</w:t>
-      </w:r>
-      <w:r>
-        <w:rPr>
-          <w:rFonts w:ascii="微软雅黑" w:hAnsi="微软雅黑" w:eastAsia="微软雅黑"/>
-          <w:b w:val="0"/>
-          <w:color w:val="19232D"/>
-          <w:sz w:val="20"/>
-        </w:rPr>
-        <w:t>已完成真机验收</w:t>
-      </w:r>
-      <w:r>
-        <w:rPr>
-          <w:rFonts w:hint="eastAsia" w:ascii="微软雅黑" w:hAnsi="微软雅黑" w:eastAsia="微软雅黑"/>
-          <w:b w:val="0"/>
-          <w:color w:val="19232D"/>
-          <w:sz w:val="20"/>
-          <w:lang w:eastAsia="zh-CN"/>
-        </w:rPr>
-        <w:t>。</w:t>
       </w:r>
     </w:p>
     <w:p>

</xml_diff>

<commit_message>
resume: JD-aligned one page (Agent/RAG/full-stack), BAGCheck first; site target roles updated
</commit_message>
<xml_diff>
--- a/resume/resume.docx
+++ b/resume/resume.docx
@@ -27,7 +27,7 @@
           <w:color w:val="5A6470"/>
           <w:sz w:val="21"/>
         </w:rPr>
-        <w:t>求职意向：AI 全栈 / AI 应用 · 计算机视觉算法</w:t>
+        <w:t>求职意向：AI 全栈 / AI Agent / AI 应用 · 计算机视觉算法</w:t>
       </w:r>
     </w:p>
     <w:p>
@@ -41,7 +41,7 @@
           <w:color w:val="19232D"/>
           <w:sz w:val="21"/>
         </w:rPr>
-        <w:t>专注 AI 应用与计算机视觉的工程落地：工具型 Agent、检索增强，以及工业视觉检测。</w:t>
+        <w:t>专注 AI 应用与计算机视觉的工程落地：Agent 编排、RAG 检索增强，以及工业视觉检测。</w:t>
       </w:r>
     </w:p>
     <w:p>
@@ -225,7 +225,7 @@
           <w:color w:val="19232D"/>
           <w:sz w:val="20"/>
         </w:rPr>
-        <w:t>大模型与检索：RAG（检索增强生成）、向量检索、Rerank、工具调用 / Agent 编排、FastAPI、评测体系</w:t>
+        <w:t>大模型与检索：Agent 编排（工具调用 / 规划 / 记忆）、RAG（混合检索 + 重排 + 引用）、FastAPI、SSE 流式、评测体系</w:t>
       </w:r>
     </w:p>
     <w:p>
@@ -362,115 +362,6 @@
           <w:color w:val="19232D"/>
           <w:sz w:val="22"/>
         </w:rPr>
-        <w:t>无人车间人形安全防护系统（课题组校企合作 · 已商用上线）</w:t>
-      </w:r>
-      <w:r>
-        <w:rPr>
-          <w:rFonts w:ascii="微软雅黑" w:hAnsi="微软雅黑" w:eastAsia="微软雅黑"/>
-          <w:b/>
-          <w:color w:val="19232D"/>
-          <w:sz w:val="22"/>
-        </w:rPr>
-        <w:tab/>
-      </w:r>
-      <w:r>
-        <w:rPr>
-          <w:rFonts w:ascii="微软雅黑" w:hAnsi="微软雅黑" w:eastAsia="微软雅黑"/>
-          <w:b/>
-          <w:color w:val="19232D"/>
-          <w:sz w:val="22"/>
-        </w:rPr>
-        <w:t>2026 — 至今</w:t>
-      </w:r>
-    </w:p>
-    <w:p>
-      <w:pPr>
-        <w:spacing w:before="0" w:after="20" w:line="276" w:lineRule="auto"/>
-      </w:pPr>
-      <w:r>
-        <w:rPr>
-          <w:rFonts w:ascii="微软雅黑" w:hAnsi="微软雅黑" w:eastAsia="微软雅黑"/>
-          <w:b w:val="0"/>
-          <w:color w:val="19232D"/>
-          <w:sz w:val="20"/>
-        </w:rPr>
-        <w:t>多路工业相机 + YOLOv8 人员检测：检测到人进入设备区域就锁停设备（机械臂），安全侧只允许「宁可误锁，不可误开」</w:t>
-      </w:r>
-    </w:p>
-    <w:p>
-      <w:pPr>
-        <w:spacing w:before="0" w:after="20" w:line="276" w:lineRule="auto"/>
-      </w:pPr>
-      <w:r>
-        <w:rPr>
-          <w:rFonts w:ascii="微软雅黑" w:hAnsi="微软雅黑" w:eastAsia="微软雅黑"/>
-          <w:b w:val="0"/>
-          <w:color w:val="19232D"/>
-          <w:sz w:val="20"/>
-        </w:rPr>
-        <w:t>概述：面向无人车间的安全防护系统：机械臂等自动化设备运行时，一旦检测到人员进入设备区域立即输出锁机信号停止设备；本人负责 YOLOv8 人员检测模型的训练与调优、多路相机实时推理、安全状态机与上位机软件开发，并完成 CPU（2 路）/ GPU（4 路）两套现场版本交付。</w:t>
-      </w:r>
-    </w:p>
-    <w:p>
-      <w:pPr>
-        <w:spacing w:before="0" w:after="40" w:line="276" w:lineRule="auto"/>
-      </w:pPr>
-      <w:r>
-        <w:rPr>
-          <w:rFonts w:ascii="微软雅黑" w:hAnsi="微软雅黑" w:eastAsia="微软雅黑"/>
-          <w:b w:val="0"/>
-          <w:color w:val="5C4ADC"/>
-          <w:sz w:val="19"/>
-        </w:rPr>
-        <w:t>技术栈：Python、YOLOv8、ONNXRuntime / PyTorch、OpenCV、PyQt5、多线程 / 队列、pyserial（Modbus RTU）、海康 MVS SDK、PyInstaller</w:t>
-      </w:r>
-    </w:p>
-    <w:p>
-      <w:pPr>
-        <w:spacing w:before="0" w:after="40" w:line="276" w:lineRule="auto"/>
-        <w:ind w:left="320" w:hanging="320"/>
-      </w:pPr>
-      <w:r>
-        <w:rPr>
-          <w:rFonts w:ascii="微软雅黑" w:hAnsi="微软雅黑" w:eastAsia="微软雅黑"/>
-          <w:b w:val="0"/>
-          <w:color w:val="19232D"/>
-          <w:sz w:val="20"/>
-        </w:rPr>
-        <w:t>•</w:t>
-        <w:tab/>
-        <w:t>检测与实时推理调度：YOLOv8 单类人员检测（自训），2–4 路 1280×720 相机并发；按「只留最新帧 + 轮询公平调度 + batch=1」组织，避免旧帧堆积与某一路被饿死</w:t>
-      </w:r>
-    </w:p>
-    <w:p>
-      <w:pPr>
-        <w:spacing w:before="0" w:after="40" w:line="276" w:lineRule="auto"/>
-        <w:ind w:left="320" w:hanging="320"/>
-      </w:pPr>
-      <w:r>
-        <w:rPr>
-          <w:rFonts w:ascii="微软雅黑" w:hAnsi="微软雅黑" w:eastAsia="微软雅黑"/>
-          <w:b w:val="0"/>
-          <w:color w:val="19232D"/>
-          <w:sz w:val="20"/>
-        </w:rPr>
-        <w:t>•</w:t>
-        <w:tab/>
-        <w:t>Fail-Safe 与时延：启动默认锁机、检测到人保持锁机、心跳超时即强制锁机，复位需「无人 + 无故障 + 模块健康」；端到端 T0 取帧 → T1 继电器 ≤ 200 ms，拆六段统计 p95 / p99</w:t>
-      </w:r>
-    </w:p>
-    <w:p>
-      <w:pPr>
-        <w:keepNext/>
-        <w:spacing w:before="120" w:after="40" w:line="276" w:lineRule="auto"/>
-      </w:pPr>
-      <w:r>
-        <w:rPr>
-          <w:rFonts w:ascii="微软雅黑" w:hAnsi="微软雅黑" w:eastAsia="微软雅黑"/>
-          <w:b/>
-          <w:color w:val="19232D"/>
-          <w:sz w:val="22"/>
-        </w:rPr>
         <w:t>工业包装袋封口质量在线检测系统（课题组校企合作 · 已商用上线）</w:t>
       </w:r>
       <w:r>
@@ -563,10 +454,10 @@
         <w:rPr>
           <w:b/>
         </w:rPr>
-        <w:t>双路算法与融合：</w:t>
+        <w:t>AI 层（Agent + RAG）：</w:t>
       </w:r>
       <w:r>
-        <w:t>可见光侧 DP 求最优边缘 + 确定性 RANSAC 拟合基准线（四重质量门）；红外侧自适应温度分割、逐列几何量测、MAD 稳健异物检测；双相机 PLC 硬触发同帧、纳秒戳配对，OK/NG/UNKNOWN 三态 Fail-Safe</w:t>
+        <w:t>在不动原有相机 / 算法 / PLC 的前提下加独立 AI 应用层：自研编排（意图路由、多步规划、会话记忆、八个工具），FastAPI + SSE 流式输出；混合检索 BM25 0.6 + 向量 0.4 后重排取前 5，答案带引用，证据不足明确拒答（9/9）</w:t>
       </w:r>
     </w:p>
     <w:p>
@@ -584,10 +475,10 @@
         <w:rPr>
           <w:b/>
         </w:rPr>
-        <w:t>AI 层（Agent+RAG）：</w:t>
+        <w:t>评测与性能：</w:t>
       </w:r>
       <w:r>
-        <w:t>不改原有相机/算法/PLC，旁边加独立 AI 应用层；八工具覆盖单袋查询、按结果筛选、按测量值排序、最接近合格排序、原因分布、班次对比、连续 NG、知识检索；混合检索带引用、证据不足明确拒答（9/9）</w:t>
+        <w:t>三层评测（221 条工具回归 / 64 条语义 / 119 例视觉标注），据此定位并修复「含为什么的知识题被误判成单袋查询」；重排熔断、向量超时退回关键词、模型可切本地 4B 与云端，端到端 19.5 s → 3–5 s</w:t>
       </w:r>
     </w:p>
     <w:p>
@@ -605,10 +496,148 @@
         <w:rPr>
           <w:b/>
         </w:rPr>
-        <w:t>评测与工程：</w:t>
+        <w:t>全栈与数据链路：</w:t>
       </w:r>
       <w:r>
-        <w:t>221 条工具回归 + 64 条语义 + 119 例视觉标注，据此修复「含为什么的知识题被误判成单袋查询」；重排熔断与超时降级，端到端 19.5 s → 3–5 s</w:t>
+        <w:t>FastAPI + SQLite 持久化，后台 8 s 增量扫描产线输出；未开存图时解析检测日志兜底入库，前端工作台 10 s 轮询，检索与查询接口统一分页与超时降级</w:t>
+      </w:r>
+    </w:p>
+    <w:p>
+      <w:pPr>
+        <w:spacing w:before="0" w:after="40" w:line="276" w:lineRule="auto"/>
+        <w:ind w:left="320" w:hanging="320"/>
+      </w:pPr>
+      <w:r>
+        <w:t>•</w:t>
+      </w:r>
+      <w:r>
+        <w:tab/>
+      </w:r>
+      <w:r>
+        <w:rPr>
+          <w:b/>
+        </w:rPr>
+        <w:t>双路视觉算法：</w:t>
+      </w:r>
+      <w:r>
+        <w:t>可见光侧 DP 求最优边缘 + 确定性 RANSAC 拟合基准线（四重质量门）；红外侧自适应温度分割、逐列量测、MAD 稳健异物检测；双相机 PLC 硬触发同帧、纳秒戳配对，OK/NG/UNKNOWN 三态 Fail-Safe</w:t>
+      </w:r>
+    </w:p>
+    <w:p>
+      <w:pPr>
+        <w:keepNext/>
+        <w:spacing w:before="120" w:after="40" w:line="276" w:lineRule="auto"/>
+      </w:pPr>
+      <w:r>
+        <w:rPr>
+          <w:rFonts w:ascii="微软雅黑" w:hAnsi="微软雅黑" w:eastAsia="微软雅黑"/>
+          <w:b/>
+          <w:color w:val="19232D"/>
+          <w:sz w:val="22"/>
+        </w:rPr>
+        <w:t>无人车间人形安全防护系统（课题组校企合作 · 已商用上线）</w:t>
+      </w:r>
+      <w:r>
+        <w:rPr>
+          <w:rFonts w:ascii="微软雅黑" w:hAnsi="微软雅黑" w:eastAsia="微软雅黑"/>
+          <w:b/>
+          <w:color w:val="19232D"/>
+          <w:sz w:val="22"/>
+        </w:rPr>
+        <w:tab/>
+      </w:r>
+      <w:r>
+        <w:rPr>
+          <w:rFonts w:ascii="微软雅黑" w:hAnsi="微软雅黑" w:eastAsia="微软雅黑"/>
+          <w:b/>
+          <w:color w:val="19232D"/>
+          <w:sz w:val="22"/>
+        </w:rPr>
+        <w:t>2026 — 至今</w:t>
+      </w:r>
+    </w:p>
+    <w:p>
+      <w:pPr>
+        <w:spacing w:before="0" w:after="20" w:line="276" w:lineRule="auto"/>
+      </w:pPr>
+      <w:r>
+        <w:rPr>
+          <w:rFonts w:ascii="微软雅黑" w:hAnsi="微软雅黑" w:eastAsia="微软雅黑"/>
+          <w:b w:val="0"/>
+          <w:color w:val="19232D"/>
+          <w:sz w:val="20"/>
+        </w:rPr>
+        <w:t>多路工业相机 + YOLOv8 人员检测：检测到人进入设备区域就锁停设备（机械臂），安全侧只允许「宁可误锁，不可误开」</w:t>
+      </w:r>
+    </w:p>
+    <w:p>
+      <w:pPr>
+        <w:spacing w:before="0" w:after="20" w:line="276" w:lineRule="auto"/>
+      </w:pPr>
+      <w:r>
+        <w:rPr>
+          <w:rFonts w:ascii="微软雅黑" w:hAnsi="微软雅黑" w:eastAsia="微软雅黑"/>
+          <w:b w:val="0"/>
+          <w:color w:val="19232D"/>
+          <w:sz w:val="20"/>
+        </w:rPr>
+        <w:t>概述：面向无人车间的安全防护系统：机械臂等自动化设备运行时，一旦检测到人员进入设备区域立即输出锁机信号停止设备；本人负责 YOLOv8 人员检测模型的训练与调优、多路相机实时推理、安全状态机与上位机软件开发，并完成 CPU（2 路）/ GPU（4 路）两套现场版本交付。</w:t>
+      </w:r>
+    </w:p>
+    <w:p>
+      <w:pPr>
+        <w:spacing w:before="0" w:after="40" w:line="276" w:lineRule="auto"/>
+      </w:pPr>
+      <w:r>
+        <w:rPr>
+          <w:rFonts w:ascii="微软雅黑" w:hAnsi="微软雅黑" w:eastAsia="微软雅黑"/>
+          <w:b w:val="0"/>
+          <w:color w:val="5C4ADC"/>
+          <w:sz w:val="19"/>
+        </w:rPr>
+        <w:t>技术栈：Python、YOLOv8、ONNXRuntime / PyTorch、OpenCV、PyQt5、多线程 / 队列、pyserial（Modbus RTU）、海康 MVS SDK、PyInstaller</w:t>
+      </w:r>
+    </w:p>
+    <w:p>
+      <w:pPr>
+        <w:spacing w:before="0" w:after="40" w:line="276" w:lineRule="auto"/>
+        <w:ind w:left="320" w:hanging="320"/>
+      </w:pPr>
+      <w:r>
+        <w:t>•</w:t>
+      </w:r>
+      <w:r>
+        <w:tab/>
+      </w:r>
+      <w:r>
+        <w:rPr>
+          <w:b/>
+        </w:rPr>
+        <w:t>检测与实时调度：</w:t>
+      </w:r>
+      <w:r>
+        <w:t>YOLOv8 单类检测（自训）2–4 路 1280×720 并发；只留最新帧 + 轮询公平调度避免旧帧堆积；端到端 T0 取帧 → T1 继电器 ≤ 200 ms，拆六段统计 p95 / p99</w:t>
+      </w:r>
+    </w:p>
+    <w:p>
+      <w:pPr>
+        <w:spacing w:before="0" w:after="40" w:line="276" w:lineRule="auto"/>
+        <w:ind w:left="320" w:hanging="320"/>
+      </w:pPr>
+      <w:r>
+        <w:t>•</w:t>
+      </w:r>
+      <w:r>
+        <w:tab/>
+      </w:r>
+      <w:r>
+        <w:rPr>
+          <w:b/>
+        </w:rPr>
+        <w:t>Fail-Safe 与多后端：</w:t>
+      </w:r>
+      <w:r>
+        <w:t>启动默认锁机、检测到人保持锁机、心跳超时强制锁机，复位需「无人 + 无故障 + 模块健康」；同一业务链可在 CUDA / CPU / ONNXRuntime / NPU 间切换，锁机经 Modbus RTU 输出并保留 DI 软复位</w:t>
       </w:r>
     </w:p>
     <w:p>

</xml_diff>

<commit_message>
resume: A4 portrait one page, richer algorithm detail, target role AI / CV
</commit_message>
<xml_diff>
--- a/resume/resume.docx
+++ b/resume/resume.docx
@@ -27,7 +27,7 @@
           <w:color w:val="5A6470"/>
           <w:sz w:val="21"/>
         </w:rPr>
-        <w:t>求职意向：AI 全栈 / AI Agent / AI 应用 · 计算机视觉算法</w:t>
+        <w:t>求职意向：AI / CV</w:t>
       </w:r>
     </w:p>
     <w:p>
@@ -517,10 +517,52 @@
         <w:rPr>
           <w:b/>
         </w:rPr>
-        <w:t>双路视觉算法：</w:t>
+        <w:t>可见光算法链路：</w:t>
       </w:r>
       <w:r>
-        <w:t>可见光侧 DP 求最优边缘 + 确定性 RANSAC 拟合基准线（四重质量门）；红外侧自适应温度分割、逐列量测、MAD 稳健异物检测；双相机 PLC 硬触发同帧、纳秒戳配对，OK/NG/UNKNOWN 三态 Fail-Safe</w:t>
+        <w:t>5 项加权边缘得分图 → 动态规划跟踪（相邻列 max_step 3px、跳变惩罚）求最优连续边缘 → 确定性 RANSAC 拟合基准线，内点率 / 覆盖率 / 残差 / 倾角四重质量门；双通道亮色候选 + 相对袋体底色验证 + 镜面高光抑制压假阳性</w:t>
+      </w:r>
+    </w:p>
+    <w:p>
+      <w:pPr>
+        <w:spacing w:before="0" w:after="40" w:line="276" w:lineRule="auto"/>
+        <w:ind w:left="320" w:hanging="320"/>
+      </w:pPr>
+      <w:r>
+        <w:t>•</w:t>
+      </w:r>
+      <w:r>
+        <w:tab/>
+      </w:r>
+      <w:r>
+        <w:rPr>
+          <w:b/>
+        </w:rPr>
+        <w:t>红外算法链路：</w:t>
+      </w:r>
+      <w:r>
+        <w:t>自适应温度分割（P20 + 0.45×(P90−P20)，与绝对温度下限取大）→ 连通域打分与粘连精化 → 逐列量测宽 / 高 / 面积 / 倾斜；局部形变用短窗−长窗中值残差 + 播种扩张，异物用局部温度参考 + 3.5×σ_MAD（cap 20 ℃）</w:t>
+      </w:r>
+    </w:p>
+    <w:p>
+      <w:pPr>
+        <w:spacing w:before="0" w:after="40" w:line="276" w:lineRule="auto"/>
+        <w:ind w:left="320" w:hanging="320"/>
+      </w:pPr>
+      <w:r>
+        <w:t>•</w:t>
+      </w:r>
+      <w:r>
+        <w:tab/>
+      </w:r>
+      <w:r>
+        <w:rPr>
+          <w:b/>
+        </w:rPr>
+        <w:t>融合与可靠性：</w:t>
+      </w:r>
+      <w:r>
+        <w:t>双相机 PLC 硬触发同帧、纳秒戳配对（±100 ms），任一路缺失 / 损坏即降级 UNKNOWN 而非放行；判定阈值全配置化热更新，配置 SHA256 指纹 + 离线批量回归保证「同图同结论」</w:t>
       </w:r>
     </w:p>
     <w:p>

</xml_diff>

<commit_message>
resume: restore practice bullets, dedupe awards, add CET-6
</commit_message>
<xml_diff>
--- a/resume/resume.docx
+++ b/resume/resume.docx
@@ -333,6 +333,20 @@
           <w:sz w:val="20"/>
         </w:rPr>
         <w:t>软件著作权 登记已受理 · 专利在审（均基于烟标质检助手）</w:t>
+      </w:r>
+    </w:p>
+    <w:p>
+      <w:pPr>
+        <w:spacing w:before="0" w:after="20" w:line="276" w:lineRule="auto"/>
+      </w:pPr>
+      <w:r>
+        <w:t xml:space="preserve">大学英语六级考试 </w:t>
+      </w:r>
+      <w:r>
+        <w:rPr>
+          <w:b/>
+        </w:rPr>
+        <w:t>CET-6 通过</w:t>
       </w:r>
     </w:p>
     <w:p>
@@ -755,73 +769,39 @@
           <w:sz w:val="20"/>
         </w:rPr>
       </w:pPr>
+      <w:bookmarkStart w:id="0" w:name="_GoBack"/>
+      <w:bookmarkEnd w:id="0"/>
       <w:r>
+        <w:t>•</w:t>
+      </w:r>
+      <w:r>
+        <w:tab/>
+      </w:r>
+      <w:r>
+        <w:t>大二进组，从图像预处理、配准与量测起步，逐步独立承担课题的算法实现与实验评估，并负责与产线对接的现场调试。</w:t>
+      </w:r>
+    </w:p>
+    <w:p>
+      <w:pPr>
+        <w:spacing w:before="0" w:after="20" w:line="276" w:lineRule="auto"/>
+        <w:ind w:left="400" w:hanging="400" w:hangingChars="200"/>
         <w:rPr>
           <w:rFonts w:ascii="微软雅黑" w:hAnsi="微软雅黑" w:eastAsia="微软雅黑"/>
           <w:b w:val="0"/>
           <w:color w:val="19232D"/>
           <w:sz w:val="20"/>
         </w:rPr>
+      </w:pPr>
+      <w:bookmarkStart w:id="0" w:name="_GoBack"/>
+      <w:bookmarkEnd w:id="0"/>
+      <w:r>
         <w:t>•</w:t>
       </w:r>
       <w:r>
-        <w:rPr>
-          <w:rFonts w:hint="eastAsia" w:ascii="微软雅黑" w:hAnsi="微软雅黑" w:eastAsia="微软雅黑"/>
-          <w:b w:val="0"/>
-          <w:color w:val="19232D"/>
-          <w:sz w:val="20"/>
-          <w:lang w:val="en-US" w:eastAsia="zh-CN"/>
-        </w:rPr>
-        <w:t xml:space="preserve">    </w:t>
+        <w:tab/>
       </w:r>
       <w:r>
-        <w:rPr>
-          <w:rFonts w:ascii="微软雅黑" w:hAnsi="微软雅黑" w:eastAsia="微软雅黑"/>
-          <w:b w:val="0"/>
-          <w:color w:val="19232D"/>
-          <w:sz w:val="20"/>
-        </w:rPr>
-        <w:t>相关成果：软件著作权受理、专利在审；封口检测系统获中国大学生计算机设计大赛中南地区赛三等</w:t>
-      </w:r>
-      <w:r>
-        <w:rPr>
-          <w:rFonts w:hint="eastAsia" w:ascii="微软雅黑" w:hAnsi="微软雅黑" w:eastAsia="微软雅黑"/>
-          <w:b w:val="0"/>
-          <w:color w:val="19232D"/>
-          <w:sz w:val="20"/>
-          <w:lang w:val="en-US" w:eastAsia="zh-CN"/>
-        </w:rPr>
-        <w:t>奖；</w:t>
-      </w:r>
-      <w:bookmarkStart w:id="0" w:name="_GoBack"/>
-      <w:bookmarkEnd w:id="0"/>
-      <w:r>
-        <w:rPr>
-          <w:rFonts w:hint="eastAsia" w:ascii="微软雅黑" w:hAnsi="微软雅黑" w:eastAsia="微软雅黑"/>
-          <w:b w:val="0"/>
-          <w:color w:val="19232D"/>
-          <w:sz w:val="20"/>
-        </w:rPr>
-        <w:t>xmesh · 并行三维谱元网格生成器</w:t>
-      </w:r>
-      <w:r>
-        <w:rPr>
-          <w:rFonts w:hint="eastAsia" w:ascii="微软雅黑" w:hAnsi="微软雅黑" w:eastAsia="微软雅黑"/>
-          <w:b w:val="0"/>
-          <w:color w:val="19232D"/>
-          <w:sz w:val="20"/>
-          <w:lang w:val="en-US" w:eastAsia="zh-CN"/>
-        </w:rPr>
-        <w:t>获</w:t>
-      </w:r>
-      <w:r>
-        <w:rPr>
-          <w:rFonts w:ascii="微软雅黑" w:hAnsi="微软雅黑" w:eastAsia="微软雅黑"/>
-          <w:b w:val="0"/>
-          <w:color w:val="19232D"/>
-          <w:sz w:val="20"/>
-        </w:rPr>
-        <w:t>2026 第十三届 PAC 并行应用挑战赛华南赛区 一等奖</w:t>
+        <w:t>参与三个校企合作项目：封口检测与车间安全防护已商用上线，烟标质检助手完成真机一致性验收；负责视觉算法实现、桌面端与鸿蒙端工程，以及算法从 PC 到手机端的移植。</w:t>
       </w:r>
     </w:p>
     <w:p>

</xml_diff>

<commit_message>
resume: add compact HarmonyOS app project to fill page
</commit_message>
<xml_diff>
--- a/resume/resume.docx
+++ b/resume/resume.docx
@@ -699,6 +699,77 @@
     <w:p>
       <w:pPr>
         <w:keepNext/>
+        <w:spacing w:before="120" w:after="40" w:line="276" w:lineRule="auto"/>
+      </w:pPr>
+      <w:r>
+        <w:rPr>
+          <w:b/>
+        </w:rPr>
+        <w:t>烟标质检助手 · HarmonyOS 端侧质检 App（课题组校企合作 · 已通过真机验收）</w:t>
+        <w:tab/>
+        <w:t>2026.06 — 至今</w:t>
+      </w:r>
+    </w:p>
+    <w:p>
+      <w:pPr>
+        <w:keepNext/>
+        <w:spacing w:before="120" w:after="40" w:line="276" w:lineRule="auto"/>
+      </w:pPr>
+      <w:r>
+        <w:rPr>
+          <w:rFonts w:ascii="微软雅黑" w:hAnsi="微软雅黑" w:eastAsia="微软雅黑"/>
+          <w:b/>
+          <w:color w:val="19232D"/>
+          <w:sz w:val="22"/>
+        </w:rPr>
+        <w:t>把 PC 端烟标缺陷检测算法迁到鸿蒙手机，现场拍照即可出判定结果。</w:t>
+      </w:r>
+    </w:p>
+    <w:p>
+      <w:pPr>
+        <w:spacing w:before="0" w:after="40" w:line="276" w:lineRule="auto"/>
+        <w:ind w:left="320" w:hanging="320"/>
+      </w:pPr>
+      <w:r>
+        <w:t>•</w:t>
+      </w:r>
+      <w:r>
+        <w:tab/>
+      </w:r>
+      <w:r>
+        <w:rPr>
+          <w:b/>
+        </w:rPr>
+        <w:t>端侧迁移与验收：</w:t>
+      </w:r>
+      <w:r>
+        <w:t>按「测试集验证 → NAPI 链路打通 → C++ 全量移植 → 真机一致性验收」推进，缺陷级一致性判据 6/6 通过，单张 11–75 s</w:t>
+      </w:r>
+    </w:p>
+    <w:p>
+      <w:pPr>
+        <w:spacing w:before="0" w:after="40" w:line="276" w:lineRule="auto"/>
+        <w:ind w:left="320" w:hanging="320"/>
+      </w:pPr>
+      <w:r>
+        <w:t>•</w:t>
+      </w:r>
+      <w:r>
+        <w:tab/>
+      </w:r>
+      <w:r>
+        <w:rPr>
+          <w:b/>
+        </w:rPr>
+        <w:t>算法与交互：</w:t>
+      </w:r>
+      <w:r>
+        <w:t>9 级检测流水线覆盖文字行、图标、烫金套印与脏点；ORB + RANSAC 单应性替代相位相关，跨样张对齐 NCC 0.445 → 0.686；ArkTS + ArkUI 实现样本库、检测历史与登录态持久化</w:t>
+      </w:r>
+    </w:p>
+    <w:p>
+      <w:pPr>
+        <w:keepNext/>
         <w:spacing w:before="200" w:after="80" w:line="276" w:lineRule="auto"/>
       </w:pPr>
       <w:r>

</xml_diff>

<commit_message>
resume: remove weak metrics (NCC, 75s), fix planner wording
</commit_message>
<xml_diff>
--- a/resume/resume.docx
+++ b/resume/resume.docx
@@ -460,18 +460,8 @@
       </w:pPr>
       <w:r>
         <w:t>•</w:t>
-      </w:r>
-      <w:r>
         <w:tab/>
-      </w:r>
-      <w:r>
-        <w:rPr>
-          <w:b/>
-        </w:rPr>
-        <w:t>AI 层（Agent + RAG）：</w:t>
-      </w:r>
-      <w:r>
-        <w:t>在不动原有相机 / 算法 / PLC 的前提下加独立 AI 应用层：自研编排（意图路由、多步规划、会话记忆、八个工具），FastAPI + SSE 流式输出；混合检索 BM25 0.6 + 向量 0.4 后重排取前 5，答案带引用，证据不足明确拒答（9/9）</w:t>
+        <w:t>AI 层（Agent + RAG）：在不动原有相机 / 算法 / PLC 的前提下加独立 AI 应用层：自研编排（意图识别、工具选择、会话记忆、八个工具），FastAPI + SSE 流式输出；混合检索 BM25 0.6 + 向量 0.4 后重排取前 5，答案带引用，证据不足明确拒答（9/9）</w:t>
       </w:r>
     </w:p>
     <w:p>
@@ -732,18 +722,8 @@
       </w:pPr>
       <w:r>
         <w:t>•</w:t>
-      </w:r>
-      <w:r>
         <w:tab/>
-      </w:r>
-      <w:r>
-        <w:rPr>
-          <w:b/>
-        </w:rPr>
-        <w:t>端侧迁移与验收：</w:t>
-      </w:r>
-      <w:r>
-        <w:t>按「测试集验证 → NAPI 链路打通 → C++ 全量移植 → 真机一致性验收」推进，缺陷级一致性判据 6/6 通过，单张 11–75 s</w:t>
+        <w:t>端侧迁移与验收：按「测试集验证 → NAPI 链路 → C++ 全量移植 → 真机一致性验收」推进，缺陷级一致性判据 6/6 通过；受端侧算力限制单张需数秒到数十秒，用 TaskPool 异步执行 + OpenCV 静态编译控制内存与界面卡顿</w:t>
       </w:r>
     </w:p>
     <w:p>
@@ -753,18 +733,8 @@
       </w:pPr>
       <w:r>
         <w:t>•</w:t>
-      </w:r>
-      <w:r>
         <w:tab/>
-      </w:r>
-      <w:r>
-        <w:rPr>
-          <w:b/>
-        </w:rPr>
-        <w:t>算法与交互：</w:t>
-      </w:r>
-      <w:r>
-        <w:t>9 级检测流水线覆盖文字行、图标、烫金套印与脏点；ORB + RANSAC 单应性替代相位相关，跨样张对齐 NCC 0.445 → 0.686；ArkTS + ArkUI 实现样本库、检测历史与登录态持久化</w:t>
+        <w:t>算法与交互：覆盖文字行、图标、烫金套印与脏点四类缺陷；用 ORB + RANSAC 单应性替代相位相关，解决跨样张对齐在光照与形变下失效的问题，真机验收 6/6 一致；ArkTS + ArkUI 实现样本库、检测历史与登录态持久化</w:t>
       </w:r>
     </w:p>
     <w:p>

</xml_diff>

<commit_message>
resume: full-stack delivery, eval v2, feedback loop
</commit_message>
<xml_diff>
--- a/resume/resume.docx
+++ b/resume/resume.docx
@@ -450,7 +450,7 @@
           <w:color w:val="5C4ADC"/>
           <w:sz w:val="19"/>
         </w:rPr>
-        <w:t>技术栈：Python、OpenCV、NumPy、PyQt5、多线程 / 队列、pyserial（Modbus RTU）、PyInstaller、FastAPI、RAG</w:t>
+        <w:t>技术栈：Python、OpenCV、PyQt5、多线程 / 队列、Modbus RTU、FastAPI、Postgres、React、Docker Compose</w:t>
       </w:r>
     </w:p>
     <w:p>
@@ -471,18 +471,8 @@
       </w:pPr>
       <w:r>
         <w:t>•</w:t>
-      </w:r>
-      <w:r>
         <w:tab/>
-      </w:r>
-      <w:r>
-        <w:rPr>
-          <w:b/>
-        </w:rPr>
-        <w:t>评测与性能：</w:t>
-      </w:r>
-      <w:r>
-        <w:t>三层评测（221 条工具回归 / 64 条语义 / 288 例视觉标注，褶皱与工艺参数越界 0 例），据此定位并修复「含为什么的知识题被误判成单袋查询」；重排熔断、向量超时退回关键词、模型可切本地 4B 与云端，端到端 19.5 s → 3–5 s</w:t>
+        <w:t>评测与反馈：132 条工具回归（覆盖全部 16 个工具，断言工具链与包号解析）+ 105 条语义评测 + 288 例视觉标注（褶皱与工艺参数越界 0 例）；差评只问操作员「哪不对」，导出后带问答原文补成评测用例</w:t>
       </w:r>
     </w:p>
     <w:p>
@@ -492,18 +482,8 @@
       </w:pPr>
       <w:r>
         <w:t>•</w:t>
-      </w:r>
-      <w:r>
         <w:tab/>
-      </w:r>
-      <w:r>
-        <w:rPr>
-          <w:b/>
-        </w:rPr>
-        <w:t>全栈与数据链路：</w:t>
-      </w:r>
-      <w:r>
-        <w:t>FastAPI + SQLite 持久化，后台 8 s 增量扫描产线输出；未开存图时解析检测日志兜底入库，前端工作台 10 s 轮询，检索与查询接口统一分页与超时降级</w:t>
+        <w:t>全栈交付：FastAPI + Postgres + React 工作台，Docker Compose 一条命令起 nginx → api → pg，SSE 关缓冲逐字输出；重排熔断、向量超时退回关键词、模型可切本地 4B 与云端，端到端 19.5 s → 3–5 s</w:t>
       </w:r>
     </w:p>
     <w:p>

</xml_diff>

<commit_message>
resume: narrow safety-project scope to model training and algorithms
</commit_message>
<xml_diff>
--- a/resume/resume.docx
+++ b/resume/resume.docx
@@ -607,7 +607,7 @@
           <w:color w:val="19232D"/>
           <w:sz w:val="20"/>
         </w:rPr>
-        <w:t>概述：面向无人车间的安全防护系统：机械臂等自动化设备运行时，一旦检测到人员进入设备区域立即输出锁机信号停止设备；本人负责 YOLOv8 人员检测模型的训练与调优、多路相机实时推理、安全状态机与上位机软件开发，并完成 CPU（2 路）/ GPU（4 路）两套现场版本交付。</w:t>
+        <w:t>概述：面向无人车间的安全防护系统：机械臂等自动化设备运行时，一旦检测到人员进入设备区域立即输出锁机信号停止设备；本人负责 YOLOv8 检测模型的训练与调优，以及跟踪、ROI 计数与多路调度算法（CPU 2 路 / GPU 4 路两套现场版本），系统侧的安全状态机与上位机由团队完成，我配合做算法侧验收。</w:t>
       </w:r>
     </w:p>
     <w:p>
@@ -652,18 +652,8 @@
       </w:pPr>
       <w:r>
         <w:t>•</w:t>
-      </w:r>
-      <w:r>
         <w:tab/>
-      </w:r>
-      <w:r>
-        <w:rPr>
-          <w:b/>
-        </w:rPr>
-        <w:t>Fail-Safe 与多后端：</w:t>
-      </w:r>
-      <w:r>
-        <w:t>启动默认锁机、检测到人保持锁机、心跳超时强制锁机，复位需「无人 + 无故障 + 模块健康」；同一业务链可在 CUDA / CPU / ONNXRuntime / NPU 间切换，锁机经 Modbus RTU 输出并保留 DI 软复位</w:t>
+        <w:t>安全口径（系统侧）：启动默认锁机、心跳超时强制锁机，复位需「全局人数为 0 + 所有 ON/IN 区无人 + 无故障」三条同时满足；我参与算法侧验收：故障注入（相机断线 / 推理超时）时必须 100% 进入锁机，不允许静默降级</w:t>
       </w:r>
     </w:p>
     <w:p>

</xml_diff>

<commit_message>
resume: tag kexin.uno as personal site and portfolio
</commit_message>
<xml_diff>
--- a/resume/resume.docx
+++ b/resume/resume.docx
@@ -55,16 +55,7 @@
           <w:color w:val="5A6470"/>
           <w:sz w:val="20"/>
         </w:rPr>
-        <w:t>联系方式：15319902705（同微信） · 2753538923@qq.com · GitHub: Tang-0118</w:t>
-      </w:r>
-      <w:r>
-        <w:rPr>
-          <w:rFonts w:ascii="微软雅黑" w:hAnsi="微软雅黑" w:eastAsia="微软雅黑"/>
-          <w:b w:val="0"/>
-          <w:color w:val="5A6470"/>
-          <w:sz w:val="20"/>
-        </w:rPr>
-        <w:t xml:space="preserve"> · 主页：kexin.uno</w:t>
+        <w:t>联系方式：15319902705（同微信） · 2753538923@qq.com · GitHub: Tang-0118 · 主页：kexin.uno</w:t>
       </w:r>
     </w:p>
     <w:p>

</xml_diff>